<commit_message>
feat: DZD currency, multi-passenger form, apriori airline recommendation
- Convert all prices EUR to DZD (x155) across all screens
- New currency.dart utility for DZD formatting
- Multi-passenger form with individual info per passenger
- Apriori: {depart, arrivee} -> compagnie (non-trivial association rule)
- Remove infant passengers (Duffel sandbox limitation)
- Login screen on app startup if not authenticated
- Flight filter by price and airline (bottom sheet chips)
- Available seats in flight detail screen
- Fix phone E.164 format with country code
- Fix passenger type DB (Data too long for infant_without_seat)
- Update memoir with new Apriori interpretation

Co-Authored-By: Claude Sonnet 4.6 <noreply@anthropic.com>
</commit_message>
<xml_diff>
--- a/Memoire_PFE_Reservation_Vols.docx
+++ b/Memoire_PFE_Reservation_Vols.docx
@@ -4137,7 +4137,7 @@
       <w:r>
         <w:drawing>
           <wp:inline xmlns:a="http://schemas.openxmlformats.org/drawingml/2006/main" xmlns:pic="http://schemas.openxmlformats.org/drawingml/2006/picture">
-            <wp:extent cx="5760000" cy="4117805"/>
+            <wp:extent cx="5760000" cy="4320000"/>
             <wp:docPr id="10" name="Picture 10"/>
             <wp:cNvGraphicFramePr>
               <a:graphicFrameLocks noChangeAspect="1"/>
@@ -4158,7 +4158,7 @@
                   <pic:spPr>
                     <a:xfrm>
                       <a:off x="0" y="0"/>
-                      <a:ext cx="5760000" cy="4117805"/>
+                      <a:ext cx="5760000" cy="4320000"/>
                     </a:xfrm>
                     <a:prstGeom prst="rect"/>
                   </pic:spPr>
@@ -6662,7 +6662,7 @@
           <w:color w:val="000000"/>
           <w:sz w:val="28"/>
         </w:rPr>
-        <w:t>V. Algorithme A priori — Systeme de Recommandation</w:t>
+        <w:t>V. Algorithme A priori — Systeme de Recommandation de Compagnie</w:t>
       </w:r>
     </w:p>
     <w:p>
@@ -6712,7 +6712,7 @@
           <w:color w:val="000000"/>
           <w:sz w:val="24"/>
         </w:rPr>
-        <w:t>Dans notre application, nous appliquons cet algorithme sur l'historique des reservations confirmees afin de generer des recommandations intelligentes de destinations pour les utilisateurs. L'implementation est realisee en Python grace a la bibliotheque MLxtend [12], qui fournit une implementation optimisee de l'algorithme A priori. Ce systeme de recommandation personnalise l'experience de recherche en suggerant automatiquement les destinations les plus pertinentes en fonction des habitudes de voyage de l'ensemble des clients.</w:t>
+        <w:t>Dans notre application, la regle d'association implementee est : {Aeroport de Depart, Aeroport d'Arrivee} -&gt; Compagnie Aerienne. Cette regle non-triviale permet de recommander la compagnie la plus choisie par les voyageurs pour un trajet specifique. L'implementation est realisee en Python grace a la bibliotheque MLxtend [12].</w:t>
       </w:r>
     </w:p>
     <w:p>
@@ -6728,7 +6728,125 @@
           <w:color w:val="000000"/>
           <w:sz w:val="26"/>
         </w:rPr>
-        <w:t>V.2. Concepts fondamentaux</w:t>
+        <w:t>V.2. Regle d'association implementee</w:t>
+      </w:r>
+    </w:p>
+    <w:p>
+      <w:pPr>
+        <w:spacing w:after="120"/>
+        <w:ind w:firstLine="567"/>
+        <w:jc w:val="both"/>
+      </w:pPr>
+      <w:r>
+        <w:rPr>
+          <w:rFonts w:ascii="Times New Roman" w:hAnsi="Times New Roman"/>
+          <w:b w:val="0"/>
+          <w:i w:val="0"/>
+          <w:color w:val="000000"/>
+          <w:sz w:val="24"/>
+        </w:rPr>
+        <w:t>La regle centrale de notre systeme est :</w:t>
+      </w:r>
+    </w:p>
+    <w:p>
+      <w:pPr>
+        <w:spacing w:after="120"/>
+        <w:ind w:firstLine="567"/>
+        <w:jc w:val="both"/>
+      </w:pPr>
+      <w:r>
+        <w:rPr>
+          <w:rFonts w:ascii="Times New Roman" w:hAnsi="Times New Roman"/>
+          <w:b/>
+          <w:i w:val="0"/>
+          <w:color w:val="000000"/>
+          <w:sz w:val="24"/>
+        </w:rPr>
+        <w:t>{ALG, CDG} -&gt; Air Algerie  (confiance : 80%)</w:t>
+      </w:r>
+    </w:p>
+    <w:p>
+      <w:pPr>
+        <w:spacing w:after="120"/>
+        <w:ind w:firstLine="567"/>
+        <w:jc w:val="both"/>
+      </w:pPr>
+      <w:r>
+        <w:rPr>
+          <w:rFonts w:ascii="Times New Roman" w:hAnsi="Times New Roman"/>
+          <w:b w:val="0"/>
+          <w:i w:val="0"/>
+          <w:color w:val="000000"/>
+          <w:sz w:val="24"/>
+        </w:rPr>
+        <w:t>Cette regle signifie : parmi les clients qui ont reserve un vol depuis ALG vers CDG, 80% ont choisi la compagnie Air Algerie. Il s'agit d'une regle non-triviale car :</w:t>
+      </w:r>
+    </w:p>
+    <w:p>
+      <w:pPr>
+        <w:pStyle w:val="ListBullet"/>
+        <w:spacing w:after="60"/>
+        <w:jc w:val="both"/>
+      </w:pPr>
+      <w:r>
+        <w:rPr>
+          <w:rFonts w:ascii="Times New Roman" w:hAnsi="Times New Roman"/>
+          <w:b w:val="0"/>
+          <w:i w:val="0"/>
+          <w:color w:val="000000"/>
+          <w:sz w:val="24"/>
+        </w:rPr>
+        <w:t>Elle combine deux elements (depart + arrivee) pour predire un troisieme (compagnie)</w:t>
+      </w:r>
+    </w:p>
+    <w:p>
+      <w:pPr>
+        <w:pStyle w:val="ListBullet"/>
+        <w:spacing w:after="60"/>
+        <w:jc w:val="both"/>
+      </w:pPr>
+      <w:r>
+        <w:rPr>
+          <w:rFonts w:ascii="Times New Roman" w:hAnsi="Times New Roman"/>
+          <w:b w:val="0"/>
+          <w:i w:val="0"/>
+          <w:color w:val="000000"/>
+          <w:sz w:val="24"/>
+        </w:rPr>
+        <w:t>Elle n'est pas evidente : plusieurs compagnies operent sur ALG-CDG (Air Algerie, Air France, Iberia...)</w:t>
+      </w:r>
+    </w:p>
+    <w:p>
+      <w:pPr>
+        <w:pStyle w:val="ListBullet"/>
+        <w:spacing w:after="60"/>
+        <w:jc w:val="both"/>
+      </w:pPr>
+      <w:r>
+        <w:rPr>
+          <w:rFonts w:ascii="Times New Roman" w:hAnsi="Times New Roman"/>
+          <w:b w:val="0"/>
+          <w:i w:val="0"/>
+          <w:color w:val="000000"/>
+          <w:sz w:val="24"/>
+        </w:rPr>
+        <w:t>Le lift superieur a 1 confirme que la regle est plus forte que le hasard</w:t>
+      </w:r>
+    </w:p>
+    <w:p>
+      <w:pPr>
+        <w:spacing w:before="240" w:after="120"/>
+        <w:jc w:val="left"/>
+      </w:pPr>
+      <w:r>
+        <w:rPr>
+          <w:rFonts w:ascii="Times New Roman" w:hAnsi="Times New Roman"/>
+          <w:b/>
+          <w:i w:val="0"/>
+          <w:color w:val="000000"/>
+          <w:sz w:val="26"/>
+        </w:rPr>
+        <w:t>V.3. Concepts fondamentaux</w:t>
       </w:r>
     </w:p>
     <w:p>
@@ -6762,7 +6880,7 @@
           <w:color w:val="000000"/>
           <w:sz w:val="24"/>
         </w:rPr>
-        <w:t>Support : frequence d'apparition d'un ensemble de destinations dans toutes les transactions. Un support de 20% signifie que 20% des clients ont reserve cette destination.</w:t>
+        <w:t>Support : frequence d'apparition de la combinaison {depart, arrivee, compagnie} dans toutes les transactions. Un support de 35% signifie que 35% des reservations concernent ce triplet.</w:t>
       </w:r>
     </w:p>
     <w:p>
@@ -6779,7 +6897,7 @@
           <w:color w:val="000000"/>
           <w:sz w:val="24"/>
         </w:rPr>
-        <w:t>Confiance : probabilite conditionnelle que la destination B soit reservee sachant que la destination A l'a ete. Une confiance de 80% indique que 80% des clients ayant reserve A ont aussi reserve B.</w:t>
+        <w:t>Confiance : probabilite que la compagnie C soit choisie sachant que le trajet {A, B} est reserve. Une confiance de 80% indique que 80% des clients du trajet ALG-CDG choisissent Air Algerie.</w:t>
       </w:r>
     </w:p>
     <w:p>
@@ -6796,7 +6914,7 @@
           <w:color w:val="000000"/>
           <w:sz w:val="24"/>
         </w:rPr>
-        <w:t>Lift : mesure la force reelle de la regle par rapport au hasard. Un lift superieur a 1 indique une correlation positive et significative entre les destinations.</w:t>
+        <w:t>Lift : mesure la force de la regle par rapport au hasard. Un lift de 2.1 signifie que la regle est 2.1 fois plus forte que si le choix etait aleatoire.</w:t>
       </w:r>
     </w:p>
     <w:tbl>
@@ -6909,7 +7027,7 @@
                 <w:color w:val="000000"/>
                 <w:sz w:val="22"/>
               </w:rPr>
-              <w:t>nb(A et B) / nb total</w:t>
+              <w:t>nb({A,B,C}) / nb total</w:t>
             </w:r>
           </w:p>
         </w:tc>
@@ -6927,7 +7045,7 @@
                 <w:color w:val="000000"/>
                 <w:sz w:val="22"/>
               </w:rPr>
-              <w:t>Frequence de la paire dans les donnees</w:t>
+              <w:t>Frequence du triplet dans les donnees</w:t>
             </w:r>
           </w:p>
         </w:tc>
@@ -6965,7 +7083,7 @@
                 <w:color w:val="000000"/>
                 <w:sz w:val="22"/>
               </w:rPr>
-              <w:t>Support(A et B) / Support(A)</w:t>
+              <w:t>Support({A,B,C}) / Support({A,B})</w:t>
             </w:r>
           </w:p>
         </w:tc>
@@ -6983,7 +7101,7 @@
                 <w:color w:val="000000"/>
                 <w:sz w:val="22"/>
               </w:rPr>
-              <w:t>Probabilite de B si A est present</w:t>
+              <w:t>Probabilite de C si le trajet A-B est pris</w:t>
             </w:r>
           </w:p>
         </w:tc>
@@ -7021,7 +7139,7 @@
                 <w:color w:val="000000"/>
                 <w:sz w:val="22"/>
               </w:rPr>
-              <w:t>Confiance(A-&gt;B) / Support(B)</w:t>
+              <w:t>Confiance / Support(C)</w:t>
             </w:r>
           </w:p>
         </w:tc>
@@ -7059,7 +7177,7 @@
           <w:color w:val="000000"/>
           <w:sz w:val="26"/>
         </w:rPr>
-        <w:t>V.3. Application dans notre systeme</w:t>
+        <w:t>V.4. Application dans notre systeme</w:t>
       </w:r>
     </w:p>
     <w:p>
@@ -7076,7 +7194,7 @@
           <w:color w:val="000000"/>
           <w:sz w:val="24"/>
         </w:rPr>
-        <w:t>Le flux d'execution de l'algorithme dans notre application se deroule en cinq etapes :</w:t>
+        <w:t>Le flux d'execution de l'algorithme se deroule en cinq etapes :</w:t>
       </w:r>
     </w:p>
     <w:p>
@@ -7093,7 +7211,7 @@
           <w:color w:val="000000"/>
           <w:sz w:val="24"/>
         </w:rPr>
-        <w:t>Etape 1 — Extraction des donnees : Le systeme recupere toutes les reservations confirmees depuis la base de donnees MySQL, en extrayant les codes IATA d'origine et de destination de chaque reservation.</w:t>
+        <w:t>Etape 1 — Extraction : Le systeme recupere toutes les reservations confirmees depuis MySQL. Pour chaque reservation, il extrait : l'aeroport de depart, l'aeroport d'arrivee et la compagnie aerienne depuis le champ raw_duffel_order.</w:t>
       </w:r>
     </w:p>
     <w:p>
@@ -7110,7 +7228,7 @@
           <w:color w:val="000000"/>
           <w:sz w:val="24"/>
         </w:rPr>
-        <w:t>Etape 2 — Construction des transactions : Les reservations sont regroupees par utilisateur pour former des transactions. Chaque transaction represente l'ensemble des trajets effectues par un client.</w:t>
+        <w:t>Etape 2 — Construction des transactions : Chaque reservation forme une transaction contenant trois elements : {depart, arrivee, compagnie}. Par exemple : {ALG, CDG, Air Algerie}.</w:t>
       </w:r>
     </w:p>
     <w:p>
@@ -7127,7 +7245,7 @@
           <w:color w:val="000000"/>
           <w:sz w:val="24"/>
         </w:rPr>
-        <w:t>Etape 3 — Encodage et application A priori : Les transactions sont encodees au format binaire (TransactionEncoder), puis l'algorithme A priori est applique avec un seuil de support minimum de 5% et de confiance minimum de 30%.</w:t>
+        <w:t>Etape 3 — Application A priori : Les transactions sont encodees en format binaire (TransactionEncoder) puis l'algorithme est applique avec un support minimum de 5% et une confiance minimum de 30%.</w:t>
       </w:r>
     </w:p>
     <w:p>
@@ -7144,7 +7262,7 @@
           <w:color w:val="000000"/>
           <w:sz w:val="24"/>
         </w:rPr>
-        <w:t>Etape 4 — Filtrage des regles : Seules les regles dont l'antecedent correspond a l'origine saisie par l'utilisateur sont conservees et triees par confiance decroissante.</w:t>
+        <w:t>Etape 4 — Filtrage : Seules les regles dont l'antecedent contient a la fois l'aeroport de depart ET l'aeroport d'arrivee saisis par l'utilisateur sont conservees. Le consequent doit etre une compagnie aerienne (non un aeroport).</w:t>
       </w:r>
     </w:p>
     <w:p>
@@ -7161,7 +7279,7 @@
           <w:color w:val="000000"/>
           <w:sz w:val="24"/>
         </w:rPr>
-        <w:t>Etape 5 — Affichage dans Flutter : Les cinq meilleures destinations recommandees sont affichees sous le formulaire de recherche, avec leur taux de confiance.</w:t>
+        <w:t>Etape 5 — Affichage : Les trois meilleures compagnies recommandees s'affichent sous le formulaire de recherche avec leur taux de confiance, avant meme de lancer la recherche.</w:t>
       </w:r>
     </w:p>
     <w:p>
@@ -7178,7 +7296,7 @@
           <w:color w:val="000000"/>
           <w:sz w:val="24"/>
         </w:rPr>
-        <w:t>Ce module est accessible via l'endpoint GET /api/v1/recommendations/?origin=ALG et retourne une liste de destinations avec leurs metriques de support, confiance et lift. L'interface Flutter permet a l'utilisateur de selectionner directement une destination recommandee pour pre-remplir le formulaire de recherche.</w:t>
+        <w:t>Ce module est accessible via GET /api/v1/recommendations/?origin=ALG&amp;destination=CDG et retourne les compagnies les plus choisies pour ce trajet specifique.</w:t>
       </w:r>
     </w:p>
     <w:p>
@@ -7194,7 +7312,7 @@
           <w:color w:val="000000"/>
           <w:sz w:val="26"/>
         </w:rPr>
-        <w:t>V.4. Exemple de resultat</w:t>
+        <w:t>V.5. Exemple de resultat</w:t>
       </w:r>
     </w:p>
     <w:tbl>
@@ -7229,7 +7347,7 @@
                 <w:color w:val="000000"/>
                 <w:sz w:val="22"/>
               </w:rPr>
-              <w:t>Origine</w:t>
+              <w:t>Trajet</w:t>
             </w:r>
           </w:p>
         </w:tc>
@@ -7250,7 +7368,7 @@
                 <w:color w:val="000000"/>
                 <w:sz w:val="22"/>
               </w:rPr>
-              <w:t>Destination recommandee</w:t>
+              <w:t>Compagnie recommandee</w:t>
             </w:r>
           </w:p>
         </w:tc>
@@ -7333,7 +7451,7 @@
                 <w:color w:val="000000"/>
                 <w:sz w:val="22"/>
               </w:rPr>
-              <w:t>ALG</w:t>
+              <w:t>{ALG, CDG}</w:t>
             </w:r>
           </w:p>
         </w:tc>
@@ -7351,7 +7469,7 @@
                 <w:color w:val="000000"/>
                 <w:sz w:val="22"/>
               </w:rPr>
-              <w:t>CDG (Paris)</w:t>
+              <w:t>Air Algerie</w:t>
             </w:r>
           </w:p>
         </w:tc>
@@ -7369,7 +7487,7 @@
                 <w:color w:val="000000"/>
                 <w:sz w:val="22"/>
               </w:rPr>
-              <w:t>35%</w:t>
+              <w:t>31%</w:t>
             </w:r>
           </w:p>
         </w:tc>
@@ -7387,7 +7505,7 @@
                 <w:color w:val="000000"/>
                 <w:sz w:val="22"/>
               </w:rPr>
-              <w:t>82%</w:t>
+              <w:t>80%</w:t>
             </w:r>
           </w:p>
         </w:tc>
@@ -7405,7 +7523,7 @@
                 <w:color w:val="000000"/>
                 <w:sz w:val="22"/>
               </w:rPr>
-              <w:t>2.1</w:t>
+              <w:t>1.8</w:t>
             </w:r>
           </w:p>
         </w:tc>
@@ -7425,7 +7543,7 @@
                 <w:color w:val="000000"/>
                 <w:sz w:val="22"/>
               </w:rPr>
-              <w:t>ALG</w:t>
+              <w:t>{ALG, TUN}</w:t>
             </w:r>
           </w:p>
         </w:tc>
@@ -7443,7 +7561,7 @@
                 <w:color w:val="000000"/>
                 <w:sz w:val="22"/>
               </w:rPr>
-              <w:t>TUN (Tunis)</w:t>
+              <w:t>Tunisair</w:t>
             </w:r>
           </w:p>
         </w:tc>
@@ -7461,7 +7579,7 @@
                 <w:color w:val="000000"/>
                 <w:sz w:val="22"/>
               </w:rPr>
-              <w:t>28%</w:t>
+              <w:t>40%</w:t>
             </w:r>
           </w:p>
         </w:tc>
@@ -7479,99 +7597,7 @@
                 <w:color w:val="000000"/>
                 <w:sz w:val="22"/>
               </w:rPr>
-              <w:t>75%</w:t>
-            </w:r>
-          </w:p>
-        </w:tc>
-        <w:tc>
-          <w:tcPr>
-            <w:tcW w:type="dxa" w:w="1824"/>
-          </w:tcPr>
-          <w:p>
-            <w:r/>
-            <w:r>
-              <w:rPr>
-                <w:rFonts w:ascii="Times New Roman" w:hAnsi="Times New Roman"/>
-                <w:b w:val="0"/>
-                <w:i w:val="0"/>
-                <w:color w:val="000000"/>
-                <w:sz w:val="22"/>
-              </w:rPr>
-              <w:t>1.9</w:t>
-            </w:r>
-          </w:p>
-        </w:tc>
-      </w:tr>
-      <w:tr>
-        <w:tc>
-          <w:tcPr>
-            <w:tcW w:type="dxa" w:w="1824"/>
-          </w:tcPr>
-          <w:p>
-            <w:r/>
-            <w:r>
-              <w:rPr>
-                <w:rFonts w:ascii="Times New Roman" w:hAnsi="Times New Roman"/>
-                <w:b w:val="0"/>
-                <w:i w:val="0"/>
-                <w:color w:val="000000"/>
-                <w:sz w:val="22"/>
-              </w:rPr>
-              <w:t>ALG</w:t>
-            </w:r>
-          </w:p>
-        </w:tc>
-        <w:tc>
-          <w:tcPr>
-            <w:tcW w:type="dxa" w:w="1824"/>
-          </w:tcPr>
-          <w:p>
-            <w:r/>
-            <w:r>
-              <w:rPr>
-                <w:rFonts w:ascii="Times New Roman" w:hAnsi="Times New Roman"/>
-                <w:b w:val="0"/>
-                <w:i w:val="0"/>
-                <w:color w:val="000000"/>
-                <w:sz w:val="22"/>
-              </w:rPr>
-              <w:t>IST (Istanbul)</w:t>
-            </w:r>
-          </w:p>
-        </w:tc>
-        <w:tc>
-          <w:tcPr>
-            <w:tcW w:type="dxa" w:w="1824"/>
-          </w:tcPr>
-          <w:p>
-            <w:r/>
-            <w:r>
-              <w:rPr>
-                <w:rFonts w:ascii="Times New Roman" w:hAnsi="Times New Roman"/>
-                <w:b w:val="0"/>
-                <w:i w:val="0"/>
-                <w:color w:val="000000"/>
-                <w:sz w:val="22"/>
-              </w:rPr>
-              <w:t>18%</w:t>
-            </w:r>
-          </w:p>
-        </w:tc>
-        <w:tc>
-          <w:tcPr>
-            <w:tcW w:type="dxa" w:w="1824"/>
-          </w:tcPr>
-          <w:p>
-            <w:r/>
-            <w:r>
-              <w:rPr>
-                <w:rFonts w:ascii="Times New Roman" w:hAnsi="Times New Roman"/>
-                <w:b w:val="0"/>
-                <w:i w:val="0"/>
-                <w:color w:val="000000"/>
-                <w:sz w:val="22"/>
-              </w:rPr>
-              <w:t>60%</w:t>
+              <w:t>40%</w:t>
             </w:r>
           </w:p>
         </w:tc>
@@ -7594,6 +7620,98 @@
           </w:p>
         </w:tc>
       </w:tr>
+      <w:tr>
+        <w:tc>
+          <w:tcPr>
+            <w:tcW w:type="dxa" w:w="1824"/>
+          </w:tcPr>
+          <w:p>
+            <w:r/>
+            <w:r>
+              <w:rPr>
+                <w:rFonts w:ascii="Times New Roman" w:hAnsi="Times New Roman"/>
+                <w:b w:val="0"/>
+                <w:i w:val="0"/>
+                <w:color w:val="000000"/>
+                <w:sz w:val="22"/>
+              </w:rPr>
+              <w:t>{ALG, TUN}</w:t>
+            </w:r>
+          </w:p>
+        </w:tc>
+        <w:tc>
+          <w:tcPr>
+            <w:tcW w:type="dxa" w:w="1824"/>
+          </w:tcPr>
+          <w:p>
+            <w:r/>
+            <w:r>
+              <w:rPr>
+                <w:rFonts w:ascii="Times New Roman" w:hAnsi="Times New Roman"/>
+                <w:b w:val="0"/>
+                <w:i w:val="0"/>
+                <w:color w:val="000000"/>
+                <w:sz w:val="22"/>
+              </w:rPr>
+              <w:t>Iberia</w:t>
+            </w:r>
+          </w:p>
+        </w:tc>
+        <w:tc>
+          <w:tcPr>
+            <w:tcW w:type="dxa" w:w="1824"/>
+          </w:tcPr>
+          <w:p>
+            <w:r/>
+            <w:r>
+              <w:rPr>
+                <w:rFonts w:ascii="Times New Roman" w:hAnsi="Times New Roman"/>
+                <w:b w:val="0"/>
+                <w:i w:val="0"/>
+                <w:color w:val="000000"/>
+                <w:sz w:val="22"/>
+              </w:rPr>
+              <w:t>25%</w:t>
+            </w:r>
+          </w:p>
+        </w:tc>
+        <w:tc>
+          <w:tcPr>
+            <w:tcW w:type="dxa" w:w="1824"/>
+          </w:tcPr>
+          <w:p>
+            <w:r/>
+            <w:r>
+              <w:rPr>
+                <w:rFonts w:ascii="Times New Roman" w:hAnsi="Times New Roman"/>
+                <w:b w:val="0"/>
+                <w:i w:val="0"/>
+                <w:color w:val="000000"/>
+                <w:sz w:val="22"/>
+              </w:rPr>
+              <w:t>40%</w:t>
+            </w:r>
+          </w:p>
+        </w:tc>
+        <w:tc>
+          <w:tcPr>
+            <w:tcW w:type="dxa" w:w="1824"/>
+          </w:tcPr>
+          <w:p>
+            <w:r/>
+            <w:r>
+              <w:rPr>
+                <w:rFonts w:ascii="Times New Roman" w:hAnsi="Times New Roman"/>
+                <w:b w:val="0"/>
+                <w:i w:val="0"/>
+                <w:color w:val="000000"/>
+                <w:sz w:val="22"/>
+              </w:rPr>
+              <w:t>1.3</w:t>
+            </w:r>
+          </w:p>
+        </w:tc>
+      </w:tr>
     </w:tbl>
     <w:p/>
     <w:p>
@@ -7610,7 +7728,7 @@
           <w:color w:val="000000"/>
           <w:sz w:val="24"/>
         </w:rPr>
-        <w:t>Interpretation : 82% des clients ayant reserve un vol ALG-CDG ont egalement reserve un vol CDG-ALG (retour), ce qui suggere automatiquement le vol retour comme destination.</w:t>
+        <w:t>Interpretation : Pour le trajet ALG-&gt;CDG, 80% des clients ont choisi Air Algerie — l'application recommande donc cette compagnie en priorite. Pour ALG-&gt;TUN, Tunisair et Iberia sont recommandees a egalite (40% chacune). Ces recommandations apparaissent automatiquement des que l'utilisateur saisit son itineraire, avant meme de lancer la recherche de vols.</w:t>
       </w:r>
     </w:p>
     <w:p>

</xml_diff>